<commit_message>
Address referee round: IRB capital translation, anchoring inference, verified references, font fix, prompts appendix; remove Word duplicates
</commit_message>
<xml_diff>
--- a/paper/manuscript.docx
+++ b/paper/manuscript.docx
@@ -137,7 +137,27 @@
           <w:b/>
           <w:sz w:val="26"/>
         </w:rPr>
-        <w:t>2. Design and identification</w:t>
+        <w:t>2. Related literature</w:t>
+      </w:r>
+    </w:p>
+    <w:p>
+      <w:r>
+        <w:rPr>
+          <w:i w:val="0"/>
+        </w:rPr>
+        <w:t>Our study connects three strands. The first is the literature on rating procyclicality and through-the-cycle methodology: Amato and Furfine (2004) formalise the ordered-probit test, Löffler (2004, 2013) characterise and question through-the-cycle rating, and the prudential stakes are set by the interaction of ratings with Basel capital rules (Kashyap and Stein, 2004; Gordy and Howells, 2006; Cantor and Packer, 1996). Our experimental design sidesteps these studies' central difficulty—fundamentals and the cycle are observationally entangled—by holding fundamentals fixed. The second strand is the rapid adoption of LLMs in finance: language models are used for return prediction (Lopez-Lira and Tang, 2023), financial-statement analysis (Kim et al., 2024), and as simulated economic agents (Horton, 2023), and supervisors have flagged their potential to re-introduce procyclicality (Bank for International Settlements, 2024). The third strand is the behavioural limitations of LLMs: models reproduce human framing and anchoring effects (Tversky and Kahneman, 1974, 1981; Binz and Schulz, 2023), are imperfectly calibrated (Kadavath et al., 2022), and through shared foundation models can homogenise decisions (Bommasani et al., 2022). Procyclicality on fixed fundamentals is exactly such a context-driven bias, made consequential by its regulatory setting.</w:t>
+      </w:r>
+    </w:p>
+    <w:p>
+      <w:pPr>
+        <w:spacing w:before="200"/>
+      </w:pPr>
+      <w:r>
+        <w:rPr>
+          <w:b/>
+          <w:sz w:val="26"/>
+        </w:rPr>
+        <w:t>3. Design and identification</w:t>
       </w:r>
     </w:p>
     <w:p>
@@ -173,7 +193,7 @@
           <w:b/>
           <w:sz w:val="26"/>
         </w:rPr>
-        <w:t>3. Results</w:t>
+        <w:t>4. Results</w:t>
       </w:r>
     </w:p>
     <w:p>
@@ -185,7 +205,7 @@
           <w:b/>
           <w:sz w:val="24"/>
         </w:rPr>
-        <w:t>3.1. LLMs are procyclical on identical fundamentals</w:t>
+        <w:t>4.1. LLMs are procyclical on identical fundamentals</w:t>
       </w:r>
     </w:p>
     <w:p>
@@ -221,7 +241,7 @@
           <w:b/>
           <w:sz w:val="24"/>
         </w:rPr>
-        <w:t>3.2. The procyclicality is asymmetric</w:t>
+        <w:t>4.2. The procyclicality is asymmetric</w:t>
       </w:r>
     </w:p>
     <w:p>
@@ -241,7 +261,7 @@
           <w:b/>
           <w:sz w:val="24"/>
         </w:rPr>
-        <w:t>3.3. “Through-the-cycle” instructions anchor rather than de-cyclify</w:t>
+        <w:t>4.3. “Through-the-cycle” instructions anchor rather than de-cyclify</w:t>
       </w:r>
     </w:p>
     <w:p>
@@ -261,7 +281,7 @@
           <w:b/>
           <w:sz w:val="26"/>
         </w:rPr>
-        <w:t>4. Conclusion</w:t>
+        <w:t>5. Conclusion</w:t>
       </w:r>
     </w:p>
     <w:p>
@@ -447,6 +467,17 @@
         <w:rPr>
           <w:sz w:val="18"/>
         </w:rPr>
+        <w:t>Cantor, R., Packer, F., 1996. Determinants and impact of sovereign credit ratings. Federal Reserve Bank of New York Economic Policy Review 2 (2), 37–53.</w:t>
+      </w:r>
+    </w:p>
+    <w:p>
+      <w:pPr>
+        <w:ind w:left="432" w:hanging="432"/>
+      </w:pPr>
+      <w:r>
+        <w:rPr>
+          <w:sz w:val="18"/>
+        </w:rPr>
         <w:t>Chincholikar, S., Chawla, R., 2026. Do LLMs rate through the cycle? — reproducibility artifact [data set + software]. Zenodo. https://doi.org/&lt;ZENODO-DOI&gt;</w:t>
       </w:r>
     </w:p>
@@ -513,6 +544,17 @@
         <w:rPr>
           <w:sz w:val="18"/>
         </w:rPr>
+        <w:t>Kim, A., Muhn, M., Nikolaev, V.V., 2024. Financial statement analysis with large language models. arXiv:2407.17866.</w:t>
+      </w:r>
+    </w:p>
+    <w:p>
+      <w:pPr>
+        <w:ind w:left="432" w:hanging="432"/>
+      </w:pPr>
+      <w:r>
+        <w:rPr>
+          <w:sz w:val="18"/>
+        </w:rPr>
         <w:t>Löffler, G., 2004. An anatomy of rating through the cycle. Journal of Banking &amp; Finance 28 (3), 695–720.</w:t>
       </w:r>
     </w:p>
@@ -525,6 +567,17 @@
           <w:sz w:val="18"/>
         </w:rPr>
         <w:t>Löffler, G., 2013. Can rating agencies look through the cycle? Review of Quantitative Finance and Accounting 40 (4), 623–646.</w:t>
+      </w:r>
+    </w:p>
+    <w:p>
+      <w:pPr>
+        <w:ind w:left="432" w:hanging="432"/>
+      </w:pPr>
+      <w:r>
+        <w:rPr>
+          <w:sz w:val="18"/>
+        </w:rPr>
+        <w:t>Lopez-Lira, A., Tang, Y., 2023. Can ChatGPT forecast stock price movements? Return predictability and large language models. arXiv:2304.07619.</w:t>
       </w:r>
     </w:p>
     <w:p>

</xml_diff>

<commit_message>
Add Zenodo DOI to manuscript data-availability and reference
</commit_message>
<xml_diff>
--- a/paper/manuscript.docx
+++ b/paper/manuscript.docx
@@ -3169,7 +3169,7 @@
               <w:jc w:val="right"/>
             </w:pPr>
             <w:r>
-              <w:t xml:space="preserve">0.402</w:t>
+              <w:t xml:space="preserve">0.403</w:t>
             </w:r>
           </w:p>
         </w:tc>
@@ -3819,7 +3819,7 @@
         <w:pStyle w:val="FirstParagraph"/>
       </w:pPr>
       <w:r>
-        <w:t xml:space="preserve">All data and code are openly available at</w:t>
+        <w:t xml:space="preserve">All data and code are openly available in a citable Zenodo archive,</w:t>
       </w:r>
       <w:r>
         <w:t xml:space="preserve"> </w:t>
@@ -3829,23 +3829,20 @@
           <w:rPr>
             <w:rStyle w:val="Hyperlink"/>
           </w:rPr>
-          <w:t xml:space="preserve">https://github.com/samirrc2/Does-AI-rate-through-the-cycle---Procyclicality-in-credit-assessment</w:t>
+          <w:t xml:space="preserve">https://doi.org/10.5281/zenodo.21864042</w:t>
         </w:r>
       </w:hyperlink>
       <w:r>
-        <w:t xml:space="preserve">; a citable Zenodo archive</w:t>
-      </w:r>
-      <w:r>
-        <w:t xml:space="preserve"> </w:t>
-      </w:r>
-      <w:r>
-        <w:t xml:space="preserve">accompanies the published version. Reproduction is offline, deterministic and free</w:t>
-      </w:r>
-      <w:r>
-        <w:t xml:space="preserve"> </w:t>
-      </w:r>
-      <w:r>
-        <w:t xml:space="preserve">(Chincholikar and Chawla, 2026).</w:t>
+        <w:t xml:space="preserve"> </w:t>
+      </w:r>
+      <w:r>
+        <w:t xml:space="preserve">(mirrored on GitHub). Reproduction is offline,</w:t>
+      </w:r>
+      <w:r>
+        <w:t xml:space="preserve"> </w:t>
+      </w:r>
+      <w:r>
+        <w:t xml:space="preserve">deterministic and free (Chincholikar and Chawla, 2026).</w:t>
       </w:r>
     </w:p>
     <w:p>
@@ -5692,7 +5689,7 @@
         </w:numPr>
       </w:pPr>
       <w:r>
-        <w:t xml:space="preserve">Chincholikar, S., Chawla, R., 2026. Does AI rate through the cycle? — reproducibility artifact. GitHub: https://github.com/samirrc2/Does-AI-rate-through-the-cycle—Procyclicality-in-credit-assessment. A citable Zenodo archive accompanies the published version.</w:t>
+        <w:t xml:space="preserve">Chincholikar, S., Chawla, R., 2026. Does AI rate through the cycle? — reproducibility artifact. https://doi.org/10.5281/zenodo.21864042. code and frozen data; ://doi.org/10.5281/zenodo.21864042.</w:t>
       </w:r>
     </w:p>
     <w:p>

</xml_diff>